<commit_message>
docs: standardize role responsibility matrix with schema fields only, removing dummy figures
</commit_message>
<xml_diff>
--- a/docs/ROLE_WISE_DOCUMENT_RESPONSIBILITY_MATRIX.docx
+++ b/docs/ROLE_WISE_DOCUMENT_RESPONSIBILITY_MATRIX.docx
@@ -21,7 +21,7 @@
           <w:color w:val="0F172A"/>
           <w:sz w:val="30"/>
         </w:rPr>
-        <w:t>IN-HOUSE PMO TOOL: PRECISE DATA ENTRY &amp; DOCUMENT MAPPING MANUAL</w:t>
+        <w:t>IN-HOUSE PMO TOOL: DATA ENTRY FIELDS &amp; DOCUMENT MAPPING MANUAL</w:t>
       </w:r>
     </w:p>
     <w:p>
@@ -34,9 +34,9 @@
           <w:color w:val="475569"/>
           <w:sz w:val="18"/>
         </w:rPr>
-        <w:t>Step-by-Step Portal Execution Guide with Form Fields &amp; Document Attachments for HTLS (GETCO 414) &amp; OPGW (KPTCL)</w:t>
+        <w:t>Standardized Module Data Entry Schema &amp; Attachment Requirements for EPC Projects</w:t>
         <w:br/>
-        <w:t>Document Ref: APAR-PMO-EXEC-2026-REV6 | Version 6.0</w:t>
+        <w:t>Document Ref: APAR-PMO-SCHEMA-2026-REV7 | Version 7.0</w:t>
       </w:r>
     </w:p>
     <w:p>
@@ -48,7 +48,7 @@
           <w:color w:val="1E293B"/>
           <w:sz w:val="17"/>
         </w:rPr>
-        <w:t>Purpose &amp; Portal Alignment: All abstract document titles have been replaced with the exact data entry fields and physical file attachments required by the active EPC Suite portal screens. This allows any user or project team to take an example project (such as GETCO 414 or KPTCL OPGW) and execute it end-to-end through the portal.</w:t>
+        <w:t>Operational Architecture &amp; Field Specification: This document outlines the comprehensive data entry fields, document attachments, and user interface screens for each core module of the In-House PMO Tool. Specific dummy numbers and sample figures have been eliminated to provide a pure, production-ready schema definition that lead owners can apply across any EPC transmission line, substation, or cabling project.</w:t>
       </w:r>
     </w:p>
     <w:p>
@@ -80,7 +80,7 @@
       <w:tr>
         <w:tc>
           <w:tcPr>
-            <w:tcW w:type="dxa" w:w="2304"/>
+            <w:tcW w:type="dxa" w:w="2160"/>
             <w:shd w:fill="0F172A"/>
             <w:tcMar>
               <w:top w:w="90" w:type="dxa"/>
@@ -124,7 +124,7 @@
         </w:tc>
         <w:tc>
           <w:tcPr>
-            <w:tcW w:type="dxa" w:w="3312"/>
+            <w:tcW w:type="dxa" w:w="3600"/>
             <w:shd w:fill="0F172A"/>
             <w:tcMar>
               <w:top w:w="90" w:type="dxa"/>
@@ -140,13 +140,13 @@
                 <w:color w:val="FFFFFF"/>
                 <w:sz w:val="17"/>
               </w:rPr>
-              <w:t>Precise Data Entry Fields &amp; Attached Documents</w:t>
+              <w:t>Required Data Entry Fields &amp; Attached Documents</w:t>
             </w:r>
           </w:p>
         </w:tc>
         <w:tc>
           <w:tcPr>
-            <w:tcW w:type="dxa" w:w="3024"/>
+            <w:tcW w:type="dxa" w:w="2880"/>
             <w:shd w:fill="0F172A"/>
             <w:tcMar>
               <w:top w:w="90" w:type="dxa"/>
@@ -170,7 +170,7 @@
       <w:tr>
         <w:tc>
           <w:tcPr>
-            <w:tcW w:type="dxa" w:w="2304"/>
+            <w:tcW w:type="dxa" w:w="2160"/>
             <w:shd w:fill="FFFFFF"/>
             <w:tcMar>
               <w:top w:w="60" w:type="dxa"/>
@@ -213,7 +213,7 @@
         </w:tc>
         <w:tc>
           <w:tcPr>
-            <w:tcW w:type="dxa" w:w="3312"/>
+            <w:tcW w:type="dxa" w:w="3600"/>
             <w:shd w:fill="FFFFFF"/>
             <w:tcMar>
               <w:top w:w="60" w:type="dxa"/>
@@ -227,28 +227,38 @@
               <w:rPr>
                 <w:sz w:val="15"/>
               </w:rPr>
-              <w:t>1. L1 Bid Evaluation: Form [Bid ID 'BID-2026-GETCO-001', Client 'GETCO', Type 'Type A HTLS', Value '₹54.20 Cr', Status 'Won', Competitor Bids table (L1 APAR ₹54.2Cr, L2 KEC ₹58.1Cr)] + File: Commercial_Bid_Opening_Memo.pdf</w:t>
+              <w:t>• DATA ENTRY FIELDS:</w:t>
+              <w:br/>
+              <w:t xml:space="preserve">  - Bid Evaluation: Bid ID, Client Name, Project Classification/Type, Total Quoted Tender Value, L1 Evaluation Status, Competitor Names, Competitor Quoted Rates &amp; Variance.</w:t>
+              <w:br/>
+              <w:t xml:space="preserve">  - LOA / LOI Ingestion: Award ID, Award Letter Ref Number, Award Date, Total Contract Value, Project Tenure (Months), Defect Liability Period (DLP).</w:t>
+              <w:br/>
+              <w:t xml:space="preserve">  - Contract Master &amp; Mother BOQ: Contract Ref Number, Execution Date, Liquidated Damages (LD) %, Retention %, Mother BOQ Grid (Item Code, Description, UOM, Contracted Qty, Basic Rate, Amount, GST %).</w:t>
+              <w:br/>
+              <w:t xml:space="preserve">  - Contract Performance BG (CPBG): BG Number, Issuing Bank &amp; Branch, BG Amount (Value &amp; % of Contract), Issue Date, Expiry/Validity Date, Claim Expiry Date.</w:t>
+              <w:br/>
+              <w:t xml:space="preserve">  - Advance Payment BG (APBG): BG Number, Issuing Bank &amp; Branch, Advance Amount Covered, Expiry Date, Recovery Milestone / Threshold.</w:t>
+              <w:br/>
+              <w:t xml:space="preserve">  - Contract Scope Variations: Addendum Ref Number, Reason for Variation, Quantity Revisions (+/-) per Mother BOQ Item, Approved Financial Variance.</w:t>
               <w:br/>
               <w:br/>
-              <w:t>2. LOA / LOI Ingestion: Form [Award ID 'AWD-2026-001', Award Ref 'GETCO/LOA/092', Date '2026-09-01', Value '₹54.20 Cr', Tenure '18 Months'] + File: Official_LOA_Letter_GETCO.pdf</w:t>
+              <w:t>• REQUIRED ATTACHMENTS:</w:t>
               <w:br/>
+              <w:t xml:space="preserve">  - Commercial Bid Opening Summary / Evaluation Sheet</w:t>
               <w:br/>
-              <w:t>3. Contract Signing &amp; Mother BOQ: Form [Contract Ref 'CTR-2026-001', Date '2026-09-10', LD '10%', Retention '5%', Mother BOQ Grid: Items 01-10 (Conductor 450KM, HW 1200 Sets, Towers 3600MT, Stubs 280MT, OPGW 85KM, Foundations 240 Locs)] + File: Executed_Contract_Agreement.pdf</w:t>
+              <w:t xml:space="preserve">  - Official Client Letter of Award (LOA) / Letter of Intent (LOI)</w:t>
               <w:br/>
+              <w:t xml:space="preserve">  - Executed Contract Agreement with Signed GCC &amp; SCC</w:t>
               <w:br/>
-              <w:t>4. Bank Guarantee (CPBG): Form [BG '00234BG26000142', Bank 'SBI CAG Mumbai', Amount '₹5,42,00,000' (10%), Valid '28-Feb-2029', Claim '31-Aug-2029'] + File: Scanned_CPBG_Bond.pdf</w:t>
+              <w:t xml:space="preserve">  - Scanned Bank Guarantee Bonds (CPBG &amp; APBG) with Bank Confirmation Letters</w:t>
               <w:br/>
-              <w:br/>
-              <w:t>5. Advance Payment BG (APBG): Form [BG 'HDFC26APBG019', Bank 'HDFC', Amount '₹5,42,00,000', Valid '10-Sep-2027'] + File: Scanned_APBG_Bond.pdf</w:t>
-              <w:br/>
-              <w:br/>
-              <w:t>6. Scope Variation Addendums: Form [Addendum Ref 'AMD-01', Reason 'Route diversion +3 KM', Revised BOQ Qty] + File: Client_Variation_Order.pdf</w:t>
+              <w:t xml:space="preserve">  - Client Approved Scope Variation Orders &amp; Addendums</w:t>
             </w:r>
           </w:p>
         </w:tc>
         <w:tc>
           <w:tcPr>
-            <w:tcW w:type="dxa" w:w="3024"/>
+            <w:tcW w:type="dxa" w:w="2880"/>
             <w:shd w:fill="FFFFFF"/>
             <w:tcMar>
               <w:top w:w="60" w:type="dxa"/>
@@ -282,7 +292,7 @@
       <w:tr>
         <w:tc>
           <w:tcPr>
-            <w:tcW w:type="dxa" w:w="2304"/>
+            <w:tcW w:type="dxa" w:w="2160"/>
             <w:shd w:fill="F8FAFC"/>
             <w:tcMar>
               <w:top w:w="60" w:type="dxa"/>
@@ -327,7 +337,7 @@
         </w:tc>
         <w:tc>
           <w:tcPr>
-            <w:tcW w:type="dxa" w:w="3312"/>
+            <w:tcW w:type="dxa" w:w="3600"/>
             <w:shd w:fill="F8FAFC"/>
             <w:tcMar>
               <w:top w:w="60" w:type="dxa"/>
@@ -341,31 +351,46 @@
               <w:rPr>
                 <w:sz w:val="15"/>
               </w:rPr>
-              <w:t>1. 30-Day Pre-LOA Walkover: Form [Route Length '85 KM', Terrain '55km Plain, 20km Hilly, 10km Forest', Subcontractors Prequalified 'Gangs G01-G06', Ingot Hedging 'Complete'] + File: Pre_Award_Risk_Matrix.xlsx</w:t>
+              <w:t>• DATA ENTRY FIELDS:</w:t>
+              <w:br/>
+              <w:t xml:space="preserve">  - 30-Day Pre-LOA Walkover: Route Alignment Length, Terrain Breakdown (Plain, Hilly, Forest, Highway/River Crossings), Prequalified Subcontractor Gang IDs, Raw Material Ingot Hedging Status.</w:t>
+              <w:br/>
+              <w:t xml:space="preserve">  - 60-Day Milestone Action Plan: Milestone WBS Code, Sequence Number, Activity Description, Duration (Days), Planned Start Date, Planned Finish Date, Predecessor Dependencies, Critical Path Flag.</w:t>
+              <w:br/>
+              <w:t xml:space="preserve">  - Advance Manufacturing Clearance: Mother BOQ Line Item Selection, Cleared Manufacturing Quantity, Designated Manufacturing Plant / Unit, Target Dispatch Week.</w:t>
+              <w:br/>
+              <w:t xml:space="preserve">  - CEIG Electrical Sanction: Application Ref Number, Submission Date, Electrical Contractor License Number &amp; Validity, Approved Crossings (Railways, Highways, Power Lines).</w:t>
+              <w:br/>
+              <w:t xml:space="preserve">  - Principal Employer Form V &amp; CLRA: Form V Ref Number, Issue Date, Maximum Approved Contract Labour Capacity, CLRA License Number, Validity Period.</w:t>
+              <w:br/>
+              <w:t xml:space="preserve">  - Central Store Readiness: Storage Yard Land Area, Perimeter Fencing Type, Security Guard Headcount, Handling Equipment / Crane Details, Sleeper Bed Capacity.</w:t>
+              <w:br/>
+              <w:t xml:space="preserve">  - Day-60 Stage Gate Sign-Off: Review Date, Prerequisite Checklist Status (BOQ, CPBG, Stubs, CEIG, Form V, Store), Readiness Verdict (Approved / Conditional / Rejected), Signatory Remarks.</w:t>
               <w:br/>
               <w:br/>
-              <w:t>2. 60-Day Master Action Plan: Form [Milestones L2-01 to L2-14, Target Ground Break 'Day 60', Critical Path 'Survey -&gt; Stubs -&gt; Store -&gt; Excavation'] + File: 60D_Action_Plan.mpp</w:t>
+              <w:t>• REQUIRED ATTACHMENTS:</w:t>
               <w:br/>
+              <w:t xml:space="preserve">  - Pre-Award Walkover Survey Report &amp; Risk Assessment Matrix</w:t>
               <w:br/>
-              <w:t>3. Advance Mfg Clearance: Form [Select Mother BOQ Item 01 Conductor '450 KM' to Apar Silvassa; Item 05 Stubs '240 Sets' to Utkarsh Steel] + File: Advance_Mfg_Clearance_LOI.pdf</w:t>
+              <w:t xml:space="preserve">  - Baseline 60-Day Master Milestone Schedule (.mpp / Gantt)</w:t>
               <w:br/>
+              <w:t xml:space="preserve">  - Advance Manufacturing Clearance Letters / LOIs</w:t>
               <w:br/>
-              <w:t>4. CEIG Electrical Sanction: Form [App Ref 'CEIG/2026/894', Date '2026-10-05', Contractor License Class-A, Approved Crossing 'NH-44 &amp; Central Rly'] + File: CEIG_Scheme_Approval.pdf</w:t>
+              <w:t xml:space="preserve">  - CEIG Scheme Approval Letter &amp; Electrical Drawing Schemes</w:t>
               <w:br/>
+              <w:t xml:space="preserve">  - Principal Employer Form V &amp; Labour Commissioner CLRA License</w:t>
               <w:br/>
-              <w:t>5. Principal Employer Form V &amp; CLRA: Form [Form V No 'MSETCL/FV/14', Date '2026-09-20', Max Labour '150', CLRA Lic 'CLRA/2026/048', Valid '29-Sep-2027'] + File: Form_V_and_CLRA_License.pdf</w:t>
+              <w:t xml:space="preserve">  - Central Store Infrastructure Audit Report &amp; Geo-tagged Site Photos</w:t>
               <w:br/>
+              <w:t xml:space="preserve">  - Day-60 Stage Gate Readiness Sign-Off Memo</w:t>
               <w:br/>
-              <w:t>6. Central Store Readiness: Form [Yard Area '5.2 Acres', Fencing '100% 2.4m GI', Security 'SIS 6 Guards', Crane '20T Hydra', Sleepers '100 Beds'] + File: Store_Readiness_Audit.pdf</w:t>
-              <w:br/>
-              <w:br/>
-              <w:t>7. 60-Day Gate Sign-off: Form [Review Date 'Day 59', 6 Criteria Green (BOQ, CPBG, Stubs, CEIG, Form V, Store), Decision 'Approved'] + File: Day60_Gate_Signoff.pdf</w:t>
+              <w:t xml:space="preserve">  - CAR &amp; Workmen Compensation Insurance Policy Copies</w:t>
             </w:r>
           </w:p>
         </w:tc>
         <w:tc>
           <w:tcPr>
-            <w:tcW w:type="dxa" w:w="3024"/>
+            <w:tcW w:type="dxa" w:w="2880"/>
             <w:shd w:fill="F8FAFC"/>
             <w:tcMar>
               <w:top w:w="60" w:type="dxa"/>
@@ -402,7 +427,7 @@
       <w:tr>
         <w:tc>
           <w:tcPr>
-            <w:tcW w:type="dxa" w:w="2304"/>
+            <w:tcW w:type="dxa" w:w="2160"/>
             <w:shd w:fill="FFFFFF"/>
             <w:tcMar>
               <w:top w:w="60" w:type="dxa"/>
@@ -447,7 +472,7 @@
         </w:tc>
         <w:tc>
           <w:tcPr>
-            <w:tcW w:type="dxa" w:w="3312"/>
+            <w:tcW w:type="dxa" w:w="3600"/>
             <w:shd w:fill="FFFFFF"/>
             <w:tcMar>
               <w:top w:w="60" w:type="dxa"/>
@@ -461,28 +486,40 @@
               <w:rPr>
                 <w:sz w:val="15"/>
               </w:rPr>
-              <w:t>1. L2 Master Schedule: Form [WBS Codes L2-01 to L2-14, Durations (Civil 90d, Erection 120d, Stringing 90d), Resource Loading, Milestone Rev-0 Lock] + File: WBS_L2_Baseline_Rev0.mpp</w:t>
+              <w:t>• DATA ENTRY FIELDS:</w:t>
+              <w:br/>
+              <w:t xml:space="preserve">  - L2 Master Schedule Baseline: WBS Activity Codes, Stage Categorization (Civil, Erection, Stringing, Testing), Planned Start &amp; End Dates, Planned Daily Productive Rates, Resource Allocations.</w:t>
+              <w:br/>
+              <w:t xml:space="preserve">  - Daily Progress Reports (DPR): DPR Date, Project Section / Segment, Gang ID, Activity Executed, Tower / Location ID, Daily Executed Quantity, Manpower Headcount, Equipment Operating Hours, Weather Condition, Idle Hours &amp; Stoppage Reason, GPS Coordinates (Latitude/Longitude).</w:t>
+              <w:br/>
+              <w:t xml:space="preserve">  - Quality Check Sheets (QCS): QCS Record ID, Tower Location ID, Activity Stage, Inspection Parameters (Diagonal Tolerances, Pit Depth, Slump, Cube Crushing Strength 7d/28d, Torque Values), Verdict (Pass/Fail/Conditional).</w:t>
+              <w:br/>
+              <w:t xml:space="preserve">  - Joint Measurement Certificate (JMC): JMC Ref Number, Certification Period (From/To), Tower Location Range, Cumulative Executed Quantities by BOQ Item, Signatory Names &amp; Designations (Contractor Lead &amp; Utility AE/EE).</w:t>
+              <w:br/>
+              <w:t xml:space="preserve">  - Pre-Commissioning Protocols: Protocol ID, Substation / Feeder Name, Insulation Resistance (Mega-Ohm) Readings, Phase Continuity Checks, OTDR Optical Loss (dB/km), Splice Attenuation Loss.</w:t>
+              <w:br/>
+              <w:t xml:space="preserve">  - Taking Over Certificate (TOC): Handover Ref Number, Trial Run Completion Date &amp; Duration, Punch List Item Count &amp; Clearance Status, Final Handover Sign-off Date.</w:t>
               <w:br/>
               <w:br/>
-              <w:t>2. Daily Progress Reports (DPR): Form [Date '2026-10-31', Segment 'Seg-01', Gang 'Gang-01', Activity 'Foundation Excavation &amp; Stub Setting', Location 'AP-01', Qty '4 Pits / 1 Stub set', Manpower '18', Hours '8', GPS Tag '21.24°N, 79.15°E'] + File: DPR_Site_Photos.pdf</w:t>
+              <w:t>• REQUIRED ATTACHMENTS:</w:t>
               <w:br/>
+              <w:t xml:space="preserve">  - Approved L2 Baseline Construction Schedule (.mpp / PDF)</w:t>
               <w:br/>
-              <w:t>3. Quality Check Sheets (QCS): Form [QCS ID 'QCS-CIV-001', Loc 'AP-01', Diagonal Tolerance '±2mm Pass', Pit Depth '3.2m Pass', Slump '100mm Pass', 7d/28d Cube Strength '16.5/24.2 N/mm² Pass'] + File: Signed_QCS_Field_Sheet.pdf</w:t>
+              <w:t xml:space="preserve">  - Daily Site Photo Dossiers (Geo-tagged &amp; Timestamped)</w:t>
               <w:br/>
+              <w:t xml:space="preserve">  - Signed Field Quality Check Sheets (QCS) &amp; Third-Party Lab Test Reports</w:t>
               <w:br/>
-              <w:t>4. Joint Measurement Certificate: Form [JMC Ref 'JMC-2026-NOV-01', Period 'Nov-2026', Towers 'AP-01 to AP-25', Work '25 Foundations Cast', Signatories 'Suresh Yadav / APAR + Er. Patil / Utility AE'] + File: Signed_JMC_Certificate.pdf</w:t>
+              <w:t xml:space="preserve">  - Dual-Signed Joint Measurement Certificates (JMC) with Measurement Sheets</w:t>
               <w:br/>
+              <w:t xml:space="preserve">  - Completed Pre-Commissioning &amp; OTDR Attenuation Trace Reports</w:t>
               <w:br/>
-              <w:t>5. Pre-Commissioning Protocols: Form [Pre-charging test, Mega-Ohm test '&gt;1000 MΩ Pass', KPTCL OTDR Attenuation Log 'Avg 0.198 dB/km Pass (spec ≤0.21)', Splice Loss '&lt;0.05 dB Pass'] + File: OTDR_Loss_Trace_Report.pdf</w:t>
-              <w:br/>
-              <w:br/>
-              <w:t>6. Taking Over Certificate (TOC): Form [TOC Ref 'TOC-2028-014', 24-hr Trial Operation 'Passed 14-Feb-2028', Punch List '100% Cleared'] + File: Utility_TOC_Certificate.pdf</w:t>
+              <w:t xml:space="preserve">  - Utility Taking Over Certificate (TOC) &amp; Trial Operation Acceptance Letter</w:t>
             </w:r>
           </w:p>
         </w:tc>
         <w:tc>
           <w:tcPr>
-            <w:tcW w:type="dxa" w:w="3024"/>
+            <w:tcW w:type="dxa" w:w="2880"/>
             <w:shd w:fill="FFFFFF"/>
             <w:tcMar>
               <w:top w:w="60" w:type="dxa"/>
@@ -516,7 +553,7 @@
       <w:tr>
         <w:tc>
           <w:tcPr>
-            <w:tcW w:type="dxa" w:w="2304"/>
+            <w:tcW w:type="dxa" w:w="2160"/>
             <w:shd w:fill="F8FAFC"/>
             <w:tcMar>
               <w:top w:w="60" w:type="dxa"/>
@@ -561,7 +598,7 @@
         </w:tc>
         <w:tc>
           <w:tcPr>
-            <w:tcW w:type="dxa" w:w="3312"/>
+            <w:tcW w:type="dxa" w:w="3600"/>
             <w:shd w:fill="F8FAFC"/>
             <w:tcMar>
               <w:top w:w="60" w:type="dxa"/>
@@ -575,31 +612,44 @@
               <w:rPr>
                 <w:sz w:val="15"/>
               </w:rPr>
-              <w:t>1. Quotation Comparison (QCS): Form [Category 'Tower Stubs', Estimate '₹2.74 Cr', Vendors: Utkarsh ₹2.56 Cr (L1), Goodluck ₹2.68 Cr (L2), Skipper ₹2.72 Cr (L3), Decision 'Award to Utkarsh'] + File: QCS_Commercial_Summary.xlsx</w:t>
+              <w:t>• DATA ENTRY FIELDS:</w:t>
+              <w:br/>
+              <w:t xml:space="preserve">  - Quotation Comparison (QCS): Sourcing Category, Internal Budgetary Estimate, Participating Vendor Names, Quoted Base Rates, Freight &amp; Packaging Terms, Evaluated Landed Costs, Recommended Vendor &amp; Selection Justification.</w:t>
+              <w:br/>
+              <w:t xml:space="preserve">  - Purchase Orders (PO): Purchase Order Number, Vendor ID &amp; Legal Entity, Mapped Mother BOQ Item Reference, Ordered Item Code &amp; Description, Quantity Ordered, Unit Basic Price, Applicable Taxes / Freight, Total PO Value, Delivery Warehouse Location, Delivery Due Date.</w:t>
+              <w:br/>
+              <w:t xml:space="preserve">  - Inspection Call Notice: Inspection Call Reference, Manufacturing Plant Location, Ready Inspection Lot Quantity, Offered Inspection Dates, Nominated Client / Third-Party Inspector Details.</w:t>
+              <w:br/>
+              <w:t xml:space="preserve">  - Joint FAT Report &amp; MTC: FAT Report ID, Inspected Parameters (Galvanizing Thickness, Tensile Strength, Chemical Composition, Dimension Checks), Heat / Batch Numbers, Inspection Verdict (Accepted/Rejected/Rectification Needed).</w:t>
+              <w:br/>
+              <w:t xml:space="preserve">  - Utility Dispatch Instruction (DI): Official Dispatch Instruction Reference, Authorized Dispatch Quantities by Item, Approved Destination Store / Consignee Details.</w:t>
+              <w:br/>
+              <w:t xml:space="preserve">  - Delivery Proofs &amp; E-Way Bills: Lorry Receipt (LR) Number, Transporter Name, Vehicle Registration Number, E-Way Bill Number &amp; Validity, Invoiced Material Quantity, Net Weighed Metric Tonnage, Arrival Date at Yard.</w:t>
+              <w:br/>
+              <w:t xml:space="preserve">  - Supplier &amp; Contractor Bills: Vendor Invoice Number, Vendor Name, Linked PO Reference, Invoice Date, Basic Value, GST Amount, Gross Invoice Value, Payment Terms, Due Date.</w:t>
               <w:br/>
               <w:br/>
-              <w:t>2. Supplier Purchase Orders: Form [PO 'PO-TWR-2026-001', Vendor 'Utkarsh India', Mother BOQ Item 05 Stubs, Qty '240 Sets / 280 MT', Rate '₹91,714/set', Value '₹2,56,80,000', Delivery Site 'Koradi Store', Due '18-Oct-2026'] + File: Signed_Purchase_Order.pdf</w:t>
+              <w:t>• REQUIRED ATTACHMENTS:</w:t>
               <w:br/>
+              <w:t xml:space="preserve">  - Approved Commercial Quotation Comparison Sheet (QCS)</w:t>
               <w:br/>
-              <w:t>3. Inspection Call Notice: Form [Call Ref 'INSP-2026-01', Plant 'Utkarsh Steel', Lot '240 Stub Sets ready', Date '07-Oct-2026', Nominated Inspector 'Er. Deshmukh / EE MSETCL'] + File: Inspection_Call_Notice.pdf</w:t>
+              <w:t xml:space="preserve">  - Digitally Signed Supplier Purchase Orders (PO) &amp; Amendments</w:t>
               <w:br/>
+              <w:t xml:space="preserve">  - Official Inspection Call Notices sent to Utility / TPIA</w:t>
               <w:br/>
-              <w:t>4. Joint FAT Report &amp; MTC: Form [FAT Ref 'FAT-UTK-01', Tests (Galvanizing '88.4 μm Pass', Steel Grade 'E250/E350 Pass', Hole Pitch 'Pass'), Verdict 'Accepted'] + File: Signed_FAT_Report_and_MTC.pdf</w:t>
+              <w:t xml:space="preserve">  - Joint FAT Inspection Reports, Mill Test Certificates (MTC) &amp; Calibration Reports</w:t>
               <w:br/>
+              <w:t xml:space="preserve">  - Approved Utility Dispatch Instructions (DI)</w:t>
               <w:br/>
-              <w:t>5. Utility Dispatch Instruction: Form [DI Ref 'DI-MSETCL-2026-088', Authorized Qty '200 KM Conductor + 240 Stub Sets', Consignee 'Koradi Central Store'] + File: Client_DI_Signed.pdf</w:t>
+              <w:t xml:space="preserve">  - Transporter Lorry Receipts (LR), E-Way Bills &amp; Weighbridge Slips</w:t>
               <w:br/>
-              <w:br/>
-              <w:t>6. Delivery Proofs &amp; E-Way Bills: Form [LR 'LR-TCI-9412', Vehicle 'MH-40-BL-4811', E-Way Bill '2418-9410-0211', Material '80 Stub Sets', Net Wt '24,150 kg'] + File: Challan_and_EWayBill.pdf</w:t>
-              <w:br/>
-              <w:br/>
-              <w:t>7. Supplier &amp; Gang Bills: Form [Bill ID 'BILL-UTK-001', Vendor 'Utkarsh', Inv No 'INV-901', Gross '₹85,60,000', GST '₹15,40,800', Net '₹1,01,00,800', Due Date '21-Nov-2026'] + File: Vendor_Tax_Invoice.pdf</w:t>
+              <w:t xml:space="preserve">  - Vendor &amp; Subcontractor Tax Invoices with Delivery Proofs (POD)</w:t>
             </w:r>
           </w:p>
         </w:tc>
         <w:tc>
           <w:tcPr>
-            <w:tcW w:type="dxa" w:w="3024"/>
+            <w:tcW w:type="dxa" w:w="2880"/>
             <w:shd w:fill="F8FAFC"/>
             <w:tcMar>
               <w:top w:w="60" w:type="dxa"/>
@@ -636,7 +686,7 @@
       <w:tr>
         <w:tc>
           <w:tcPr>
-            <w:tcW w:type="dxa" w:w="2304"/>
+            <w:tcW w:type="dxa" w:w="2160"/>
             <w:shd w:fill="FFFFFF"/>
             <w:tcMar>
               <w:top w:w="60" w:type="dxa"/>
@@ -681,7 +731,7 @@
         </w:tc>
         <w:tc>
           <w:tcPr>
-            <w:tcW w:type="dxa" w:w="3312"/>
+            <w:tcW w:type="dxa" w:w="3600"/>
             <w:shd w:fill="FFFFFF"/>
             <w:tcMar>
               <w:top w:w="60" w:type="dxa"/>
@@ -695,25 +745,36 @@
               <w:rPr>
                 <w:sz w:val="15"/>
               </w:rPr>
-              <w:t>1. Client RA Tax Invoices: Form [Invoice No 'INV-RA-01-GETCO', Milestone '70% Supply on Site Delivery', Gross '₹17,28,00,000', GST 18% '₹3,11,04,000', Retention 5% '₹86,40,000', Net Receivable '₹19,52,64,000', Due '45 days'] + File: Client_Tax_Invoice_RA01.pdf</w:t>
+              <w:t>• DATA ENTRY FIELDS:</w:t>
+              <w:br/>
+              <w:t xml:space="preserve">  - Client RA Tax Invoices: Invoice Reference Number, Project Name, Billing Milestone Stage (Supply, Erection, Testing, TOC), Linked JMC / DI References, Gross Certified Work Value, Applicable GST (%), Retention Deductions (%), Net Receivable Amount, Contractual Payment Due Date.</w:t>
+              <w:br/>
+              <w:t xml:space="preserve">  - Invoicing-to-Collections Allocation: Bank Remittance Reference, Bank Transaction UTR Number, Value Date of Credit, Amount Realized in Bank Account, Allocated Invoice Number(s), TDS Deducted (Sec 194C), GST TDS Deducted, Unallocated Balance.</w:t>
+              <w:br/>
+              <w:t xml:space="preserve">  - Debtor Payment Ageing: Project Master ID, Invoice Ageing Buckets (Not Due, 1–30 Days, 31–60 Days, 61–90 Days, &gt;90 Days Overdue), Outstanding Debtor Balance, Weighted Average Collection Days.</w:t>
+              <w:br/>
+              <w:t xml:space="preserve">  - Client Deductions &amp; Withholdings: Deduction Entry ID, Mapped RA Invoice Number, Deduction Category (TDS, GST-TDS, Retention, Liquidated Damages, Defect Withholding), Deduction Amount, Recovery / Clearance Status.</w:t>
+              <w:br/>
+              <w:t xml:space="preserve">  - Contractual Milestones Compliance: Milestone ID, Milestone Description, Milestone Percentage Weightage, Target Billing Value, Certified Billed Amount, Realized Collection Amount, Pending Milestone Balance.</w:t>
               <w:br/>
               <w:br/>
-              <w:t>2. Invoicing-to-Collections Mapping: Form [Remittance 'REMIT-2026-08', Bank UTR 'SBIN263041920', Credit Date '2026-11-15', Realized '₹18,50,00,000', Mapped Inv 'INV-RA-01', TDS '₹38,00,000', Balance '₹64,64,000'] + File: Bank_Credit_Advice.pdf</w:t>
+              <w:t>• REQUIRED ATTACHMENTS:</w:t>
               <w:br/>
+              <w:t xml:space="preserve">  - Signed Client RA Tax Invoices with Supporting Measurement Sheets</w:t>
               <w:br/>
-              <w:t>3. Debtor Payment Ageing: Form [Project 'GETCO 414', Buckets (Not Due '₹19.52 Cr', 1-30d '₹0', 31-60d '₹0', &gt;90d '₹0'), Total Debtor Book '₹19.52 Cr', Wtd Avg Collection '38 Days'] + File: Debtor_Ageing_MIS.xlsx</w:t>
+              <w:t xml:space="preserve">  - Official Bank Remittance Advices &amp; Credit Confirmation Statements</w:t>
               <w:br/>
+              <w:t xml:space="preserve">  - Periodic Debtor Ageing &amp; Payment Realization Summary Reports</w:t>
               <w:br/>
-              <w:t>4. Client Deductions Reconciliation: Form [Deduction Ref 'DED-RA-01', TDS Sec 194C '₹34,56,000', GST TDS '₹3,45,600', Retention '₹86,40,000', Liquidated Damages '₹0 Nil'] + File: TDS_Certificate_and_Voucher.pdf</w:t>
+              <w:t xml:space="preserve">  - TDS Certificates (Form 16A) &amp; Utility Payment Deduction Vouchers</w:t>
               <w:br/>
-              <w:br/>
-              <w:t>5. Billing Milestones Compliance: Form [Milestone 'M1 Conductor Supply 80%', Billed '₹17.28 Cr', Realized '₹18.50 Cr', Next Milestone 'M2 Foundations JMC 10%'] + File: Milestone_Billing_MIS.xlsx</w:t>
+              <w:t xml:space="preserve">  - Milestone Achievement Verification &amp; Billing Compliance Schedules</w:t>
             </w:r>
           </w:p>
         </w:tc>
         <w:tc>
           <w:tcPr>
-            <w:tcW w:type="dxa" w:w="3024"/>
+            <w:tcW w:type="dxa" w:w="2880"/>
             <w:shd w:fill="FFFFFF"/>
             <w:tcMar>
               <w:top w:w="60" w:type="dxa"/>
@@ -747,7 +808,7 @@
       <w:tr>
         <w:tc>
           <w:tcPr>
-            <w:tcW w:type="dxa" w:w="2304"/>
+            <w:tcW w:type="dxa" w:w="2160"/>
             <w:shd w:fill="F8FAFC"/>
             <w:tcMar>
               <w:top w:w="60" w:type="dxa"/>
@@ -792,7 +853,7 @@
         </w:tc>
         <w:tc>
           <w:tcPr>
-            <w:tcW w:type="dxa" w:w="3312"/>
+            <w:tcW w:type="dxa" w:w="3600"/>
             <w:shd w:fill="F8FAFC"/>
             <w:tcMar>
               <w:top w:w="60" w:type="dxa"/>
@@ -806,25 +867,36 @@
               <w:rPr>
                 <w:sz w:val="15"/>
               </w:rPr>
-              <w:t>1. Baseline Cost Budget (CBS): Form [Tender Budget '₹46,07,00,000', Cost Ceilings: Conductor '₹18.50 Cr', Buyout '₹14.20 Cr', Civil '₹6.80 Cr', Services '₹4.10 Cr', Overheads '₹2.47 Cr', Planned Margin '15.0% ₹8.13 Cr'] + File: Project_Baseline_CBS_Budget.xlsx</w:t>
+              <w:t>• DATA ENTRY FIELDS:</w:t>
+              <w:br/>
+              <w:t xml:space="preserve">  - Baseline Cost Budget (CBS): CBS Node Codes, Budget Categories (Conductor, Structural Steel, Buyouts, Civil Works, Erection Services, Project Overheads, Contingency), Tender Cost Baseline, Approved Revised Budget, Target Gross Margin (%).</w:t>
+              <w:br/>
+              <w:t xml:space="preserve">  - Unbilled WIP MIS: Reporting Period (Month/Quarter), Material Delivered at Site Unbilled, Foundations/Erection Executed Uncertified, Total Work-in-Progress Valuation, Estimated Certification Date.</w:t>
+              <w:br/>
+              <w:t xml:space="preserve">  - Creditors MIS &amp; Payables Ageing: Vendor Master ID, Creditor Invoice Balances, Ageing Classification (Not Due, 1–30 Days, 31–60 Days, &gt;60 Days Overdue), Projected Cash Outflow (15/30 Days), Hold/Disputed Amounts.</w:t>
+              <w:br/>
+              <w:t xml:space="preserve">  - Bid vs Actual Profitability: Cumulative Recognized Revenue, Cumulative Actual Cost Incurred, Material Variance, Labour Variance, Logistics Variance, Actual Margin (%) vs Bid Baseline Margin (%), Profitability Deviation.</w:t>
+              <w:br/>
+              <w:t xml:space="preserve">  - Working Capital GFI / NFI Days: Gross Funds Invested (GFI), Trade Receivables, Total Site Inventory &amp; WIP, Trade Payables / Creditors, Net Funds Invested (NFI), Days Sales Outstanding (DSO / Debtor Days), Days Inventory Outstanding (DIO), Days Payable Outstanding (DPO), Net Working Capital Cycle (NFI Days).</w:t>
               <w:br/>
               <w:br/>
-              <w:t>2. Unbilled Revenue MIS (WIP): Form [Month 'Nov-2026', Delivered Material Unbilled '₹2.56 Cr Stubs', Executed Foundations Uncertified '₹42.0 Lakhs Loc AP01-AP10', Total WIP '₹2.98 Cr'] + File: Unbilled_Revenue_Schedule.xlsx</w:t>
+              <w:t>• REQUIRED ATTACHMENTS:</w:t>
               <w:br/>
+              <w:t xml:space="preserve">  - Approved Project Baseline CBS Budget Sheet</w:t>
               <w:br/>
-              <w:t>3. Creditors MIS &amp; Payables Ageing: Form [Accounts Payable '₹4.12 Cr', Not Due '₹3.10 Cr', Due 1-30d '₹1.02 Cr', Overdue &gt;60d '₹0 Nil', 15-day Projected Outflow '₹1.50 Cr'] + File: Creditors_Ageing_Schedule.xlsx</w:t>
+              <w:t xml:space="preserve">  - Monthly Unbilled Revenue &amp; Work-in-Progress (WIP) Valuation Schedules</w:t>
               <w:br/>
+              <w:t xml:space="preserve">  - Accounts Payable Creditors Ageing &amp; Cash Outflow Forecast Reports</w:t>
               <w:br/>
-              <w:t>4. Bid vs Actual Profitability: Form [Revenue Recognized '₹19.52 Cr', Actual Cost '₹16.20 Cr', Realized Margin '17.0% vs Planned 15.0%', Favorable Variance '+2.0%'] + File: Profitability_Variance_Report.xlsx</w:t>
+              <w:t xml:space="preserve">  - Monthly Bid vs Actual Cost Variance &amp; Margin Deviation Reports</w:t>
               <w:br/>
-              <w:br/>
-              <w:t>5. Working Capital GFI / NFI Days: Form [Gross Funds GFI '₹22.50 Cr', Debtors '₹19.52 Cr', Inventory/WIP '₹5.10 Cr', Creditors '₹4.12 Cr', Net Funds NFI '₹20.50 Cr', Debtor Days '38', Inventory Days '18', Creditor Days '32', Net NFI Days '24 Days'] + File: GFI_NFI_Days_Worksheet.xlsx</w:t>
+              <w:t xml:space="preserve">  - Working Capital Computation Worksheets (GFI, NFI &amp; Working Capital Cycle)</w:t>
             </w:r>
           </w:p>
         </w:tc>
         <w:tc>
           <w:tcPr>
-            <w:tcW w:type="dxa" w:w="3024"/>
+            <w:tcW w:type="dxa" w:w="2880"/>
             <w:shd w:fill="F8FAFC"/>
             <w:tcMar>
               <w:top w:w="60" w:type="dxa"/>
@@ -858,7 +930,7 @@
       <w:tr>
         <w:tc>
           <w:tcPr>
-            <w:tcW w:type="dxa" w:w="2304"/>
+            <w:tcW w:type="dxa" w:w="2160"/>
             <w:shd w:fill="FFFFFF"/>
             <w:tcMar>
               <w:top w:w="60" w:type="dxa"/>
@@ -901,7 +973,7 @@
         </w:tc>
         <w:tc>
           <w:tcPr>
-            <w:tcW w:type="dxa" w:w="3312"/>
+            <w:tcW w:type="dxa" w:w="3600"/>
             <w:shd w:fill="FFFFFF"/>
             <w:tcMar>
               <w:top w:w="60" w:type="dxa"/>
@@ -915,25 +987,36 @@
               <w:rPr>
                 <w:sz w:val="15"/>
               </w:rPr>
-              <w:t>1. Time Limit Extension (EOT): Form [Claim 'EOT-CLM-001', Event 'EVT-ROW-02', Days Claimed '45 Days', Milestone 'Foundations', Cost Claimed '₹34,50,000', Clause 'Clause 38.2 Employer Delay'] + File: EOT_Claim_Dossier_with_Time_Impact.pdf</w:t>
+              <w:t>• DATA ENTRY FIELDS:</w:t>
+              <w:br/>
+              <w:t xml:space="preserve">  - Time Limit Extension (EOT): EOT Claim ID, Linked Delay Event ID, Contractual Clause Invoked (Employer Delay / Force Majeure), Extension Days Claimed, Impacted Critical Path Milestone, Financial Prolongation Cost Claimed, Claim Submission Date, Utility Determination Status.</w:t>
+              <w:br/>
+              <w:t xml:space="preserve">  - Notice of Delay (NOD) Events: Event Identification Code, Delay Cause Categorization (Right of Way, Severe Weather, Drawing Approval Delay, Utility Shutdown Delay), Date of Event Occurrence, Affected Tower Location / Span Range, Contractual Notice Due Date (7/14-Day Limit), Date Notice Served to Client.</w:t>
+              <w:br/>
+              <w:t xml:space="preserve">  - Permit to Work (PTW Shutdown): PTW Reference Number, Line Crossing Span Details, Crossing Voltage / Circuit Classification, Requested Outage Date &amp; Time Window, Granted Shutdown Window, Site Safety Supervisor Assigned, Earthing Protocol Compliance.</w:t>
+              <w:br/>
+              <w:t xml:space="preserve">  - Idling Machinery &amp; Gang Claims: Idling Log ID, Impacted Subcontractor Gang ID, Idled Equipment Type &amp; Machine ID, Date &amp; Duration of Stoppage (Hours/Days), Root Cause of Stoppage, Calculated Idling Expense, Client Site Verification Status.</w:t>
+              <w:br/>
+              <w:t xml:space="preserve">  - Project Correspondence Register: Transmittal Reference Number, Document Number, Drawing Title, Revision Level, Purpose of Issue (For Review, For Approval, For Construction), Submission Date, Client Comment Code (A1, A2, A3), Client Response Date.</w:t>
               <w:br/>
               <w:br/>
-              <w:t>2. Notice of Delay Events: Form [Event 'EVT-ROW-02', Type 'Right of Way Dispute', Date '2026-10-14', Chainage 'AP-18 to AP-22', Status 'NOD_ISSUED', Notice Served Date '2026-10-16'] + File: Contractual_Notice_of_Delay_Letter.pdf</w:t>
+              <w:t>• REQUIRED ATTACHMENTS:</w:t>
               <w:br/>
+              <w:t xml:space="preserve">  - Formal EOT Claim Dossiers with Time Impact Schedule Analysis (.mpp / PDF)</w:t>
               <w:br/>
-              <w:t>3. Permit to Work (PTW Shutdown): Form [PTW 'PTW-2026-OUT-14', Crossing 'Span AP44-AP45', Crossed Line '132kV Feeder', Outage Date '2026-11-20', Window '08:00-17:00', Safety Earthing 'Confirmed'] + File: Approved_PTW_Shutdown_Memo.pdf</w:t>
+              <w:t xml:space="preserve">  - Contractual Notice of Delay (NOD) Letters with Delivery Proofs</w:t>
               <w:br/>
+              <w:t xml:space="preserve">  - Approved Utility Permit to Work (PTW) &amp; Line Outage Sanction Memos</w:t>
               <w:br/>
-              <w:t>4. Idling Machinery &amp; Gang Claims: Form [Log 'IDL-2026-05', Gang 'Gang-03', Equipment Idled '1x 20T Hydra Crane + 1x JCB', Idle Hours '48 Hours', Idle Cost '₹1,85,000'] + File: Plant_and_Gang_Idling_Log_Sheets.pdf</w:t>
+              <w:t xml:space="preserve">  - Jointly Verified Machinery &amp; Subcontractor Idling Log Sheets</w:t>
               <w:br/>
-              <w:br/>
-              <w:t>5. Project Correspondence Register: Form [Transmittal 'APAR-TR-003', Subject 'OPGW Drum Length Schedule Rev B', Recipient 'Mr. Desai / GETCO', Status 'A1 Approved'] + File: Signed_Transmittal_Package_and_CRS.pdf</w:t>
+              <w:t xml:space="preserve">  - Transmittal Packages, Drawing Submission Sets &amp; Comment Response Sheets (CRS)</w:t>
             </w:r>
           </w:p>
         </w:tc>
         <w:tc>
           <w:tcPr>
-            <w:tcW w:type="dxa" w:w="3024"/>
+            <w:tcW w:type="dxa" w:w="2880"/>
             <w:shd w:fill="FFFFFF"/>
             <w:tcMar>
               <w:top w:w="60" w:type="dxa"/>
@@ -967,7 +1050,7 @@
       <w:tr>
         <w:tc>
           <w:tcPr>
-            <w:tcW w:type="dxa" w:w="2304"/>
+            <w:tcW w:type="dxa" w:w="2160"/>
             <w:shd w:fill="F8FAFC"/>
             <w:tcMar>
               <w:top w:w="60" w:type="dxa"/>
@@ -1012,7 +1095,7 @@
         </w:tc>
         <w:tc>
           <w:tcPr>
-            <w:tcW w:type="dxa" w:w="3312"/>
+            <w:tcW w:type="dxa" w:w="3600"/>
             <w:shd w:fill="F8FAFC"/>
             <w:tcMar>
               <w:top w:w="60" w:type="dxa"/>
@@ -1026,28 +1109,40 @@
               <w:rPr>
                 <w:sz w:val="15"/>
               </w:rPr>
-              <w:t>1. Daily Stock Ledger &amp; Bin Cards: Form [Item 'MSETCL-MAT-05 Stubs ST-DA', Location 'Yard Bay S-01', Inwarded '140 Sets', Issued to Gang '16 Sets Gang-01', Store Balance '124 Sets', UOM 'Sets'] + File: Digital_Bin_Card_Stock_Extract.xlsx</w:t>
+              <w:t>• DATA ENTRY FIELDS:</w:t>
+              <w:br/>
+              <w:t xml:space="preserve">  - Daily Stock Ledger &amp; Bin Cards: Material Item Master Code, Item Description, Store / Yard Storage Bay Location, Unit of Measurement (UOM), Inwarded Quantity, Quantity Issued to Subcontractor Gang, Gang ID, Current Available Stock Balance, Minimum Reorder Level.</w:t>
+              <w:br/>
+              <w:t xml:space="preserve">  - Monthly Material Reconciliation: Reconciliation Period (Month/Year), Material Received under Utility DIs, Material Certified in Client JMCs, Permissible Scrap %, Actual Scrap Generated, Uninstalled Yard Stock, Material Variance / Reconciliation Balance.</w:t>
+              <w:br/>
+              <w:t xml:space="preserve">  - Stock Transfer Orders (STO): STO Reference Number, Originating / Dispatching Store, Destination / Receiving Store, Material Item Codes &amp; Transfer Quantities, Assigned Transporter Name, Vehicle Registration Number, Transfer Date, Receiving Yard Inward Confirmation.</w:t>
+              <w:br/>
+              <w:t xml:space="preserve">  - Tools &amp; Plants (T&amp;P) Inventory: Equipment Asset Code, Asset Description, Deployed Quantity, Physical Condition Rating, Assigned Subcontractor Gang ID, Last Load/Safety Test Date, Next Periodic Inspection Due Date.</w:t>
+              <w:br/>
+              <w:t xml:space="preserve">  - Tension Stringing Equipment (TSE): TSE Machine Code (Tensioner / Puller), Machine Serial Number, Operating Hours (Run Hours), Line Segment / Span Deployed, Machine Operator Name, Last Calibration Date, Hydraulic / Engine Service Due Date.</w:t>
+              <w:br/>
+              <w:t xml:space="preserve">  - Scrap &amp; Surplus Disposal: Disposal Lot ID, Material Category (Aluminium Conductor Cuts, Structural Steel Offcuts, Wooden Cable Drums), Disposed Quantity &amp; Weight (kg), Disposal Authorization Reference, Buyer / Auction Details, Gate Pass Number.</w:t>
               <w:br/>
               <w:br/>
-              <w:t>2. Monthly Material Reconciliation: Form [Month 'Nov-2026', HTLS Conductor: Received Under DI '200.00 KM', Certified in JMC '42.50 KM', Scrap '0.35 KM', Store Balance '157.15 KM', Variance '0.00 KM Balanced'] + File: Monthly_Material_Reconciliation_MRR.xlsx</w:t>
+              <w:t>• REQUIRED ATTACHMENTS:</w:t>
               <w:br/>
+              <w:t xml:space="preserve">  - Daily Digital Bin Card Stock Balance Sheets</w:t>
               <w:br/>
-              <w:t>3. Stock Transfer Orders (STO): Form [STO 'STO-2026-04', Sending Store 'GETCO 414 Store', Receiving Store 'KPTCL OPGW Store Hubli', Material '12x Joint Boxes + 50x Suspension Clamps', Vehicle 'KA-25-A-8114'] + File: Inter_Project_STO_Manifest.pdf</w:t>
+              <w:t xml:space="preserve">  - Monthly Material Reconciliation Reports (MRR) signed with Utility Representative</w:t>
               <w:br/>
+              <w:t xml:space="preserve">  - Inter-Project Stock Transfer (STO) Manifests &amp; Material Gate Passes</w:t>
               <w:br/>
-              <w:t>4. Tools &amp; Plants (T&amp;P) Inventory: Form [Asset 'TP-SL-041 Come-Along Clamps', Qty '24 Nos', Condition 'Load Tested Good', Gang Assigned 'Gang-02 Erection', Test Date '2026-09-15'] + File: TP_Site_Allocation_Register.xlsx</w:t>
+              <w:t xml:space="preserve">  - Tools &amp; Plants (T&amp;P) Site Allocation Registers &amp; Safety Inspection Certificates</w:t>
               <w:br/>
+              <w:t xml:space="preserve">  - TSE Machine Calibration Reports, Maintenance Logs &amp; Load Test Certifications</w:t>
               <w:br/>
-              <w:t>5. Tension Stringing Equipment (TSE): Form [Asset 'TSE-TEN-002', Description 'OMAC 40kN Tensioner', Serial 'OM-8941', Run Hours '412 hrs', Status 'Active Segment-01 Stringing', Operator 'Rameshwar Singh'] + File: TSE_Calibration_and_Maintenance_Log.pdf</w:t>
-              <w:br/>
-              <w:br/>
-              <w:t>6. Scrap &amp; Surplus Disposal: Form [Lot 'SCR-2027-01', Scrap 'Aluminium conductor cut pieces &amp; empty wooden drums', Qty '1,420 kg Al + 45 drums', Witness 'Er. Patil / Utility AE'] + File: Scrap_Disposal_Certificate.pdf</w:t>
+              <w:t xml:space="preserve">  - Scrap Disposal Authorization Certificates &amp; Salvage Gate Passes</w:t>
             </w:r>
           </w:p>
         </w:tc>
         <w:tc>
           <w:tcPr>
-            <w:tcW w:type="dxa" w:w="3024"/>
+            <w:tcW w:type="dxa" w:w="2880"/>
             <w:shd w:fill="F8FAFC"/>
             <w:tcMar>
               <w:top w:w="60" w:type="dxa"/>
@@ -1105,7 +1200,7 @@
         <w:rPr>
           <w:sz w:val="18"/>
         </w:rPr>
-        <w:t>By signing below, each designated module lead confirms that the exact portal data entry fields, document attachments, and UI screen mappings defined above accurately represent their operational requirements for executing HTLS (GETCO 414) and OPGW (KPTCL) projects.</w:t>
+        <w:t>By signing below, each designated module lead confirms that the standardized data entry fields, document attachments, and UI screen mappings defined above accurately represent their operational requirements for executing EPC projects within the PMO Tool.</w:t>
       </w:r>
     </w:p>
     <w:tbl>

</xml_diff>